<commit_message>
Fix change matrix: show stable area numbers instead of dashes
The change matrix diagonal cells showed "---" instead of actual
hectare values for stable (unchanged) area. Fixed to show:
- Coral to coral: 1,140 ha (stable)
- Seagrass to seagrass: 790 ha (stable)
- Mangrove to mangrove: 300 ha (stable)
- Other to other: 7,500 ha (stable)

Also fixed:
- Column headers: "Total reductions" → "Opening total" and added
  "Closing total" row (proper SEEA EA format)
- Condition composite row: "--" → "average" and blank reference
- Diagonal cells highlighted in mint (#D4EEE5) for visual clarity

Updated in: example_account_tables_print.docx and all print notebook
copies (01-extent, 02-condition, 03-services).

Co-Authored-By: Claude Opus 4.6 (1M context) <noreply@anthropic.com>
</commit_message>
<xml_diff>
--- a/s-s-event-bogor/print-notebooks/02-condition/07-example-tables.docx
+++ b/s-s-event-bogor/print-notebooks/02-condition/07-example-tables.docx
@@ -2801,7 +2801,7 @@
                 <w:color w:val="FFFFFF"/>
                 <w:sz w:val="20"/>
               </w:rPr>
-              <w:t>Total reductions</w:t>
+              <w:t>Opening total</w:t>
             </w:r>
           </w:p>
         </w:tc>
@@ -2851,7 +2851,7 @@
               <w:bottom w:val="single" w:sz="8" w:space="0" w:color="404040"/>
               <w:right w:val="single" w:sz="8" w:space="0" w:color="404040"/>
             </w:tcBorders>
-            <w:shd w:fill="D9D9D9" w:val="clear"/>
+            <w:shd w:fill="D4EEE5" w:val="clear"/>
           </w:tcPr>
           <w:p>
             <w:pPr>
@@ -2873,7 +2873,7 @@
                 <w:color w:val="30302F"/>
                 <w:sz w:val="20"/>
               </w:rPr>
-              <w:t>---</w:t>
+              <w:t>1 140</w:t>
             </w:r>
           </w:p>
         </w:tc>
@@ -2941,7 +2941,7 @@
                 <w:color w:val="30302F"/>
                 <w:sz w:val="20"/>
               </w:rPr>
-              <w:t>5</w:t>
+              <w:t>0</w:t>
             </w:r>
           </w:p>
         </w:tc>
@@ -2975,7 +2975,7 @@
                 <w:color w:val="30302F"/>
                 <w:sz w:val="20"/>
               </w:rPr>
-              <w:t>80</w:t>
+              <w:t>85</w:t>
             </w:r>
           </w:p>
         </w:tc>
@@ -3009,7 +3009,7 @@
                 <w:color w:val="30302F"/>
                 <w:sz w:val="20"/>
               </w:rPr>
-              <w:t>100</w:t>
+              <w:t>1 240</w:t>
             </w:r>
           </w:p>
         </w:tc>
@@ -3093,7 +3093,7 @@
               <w:bottom w:val="single" w:sz="8" w:space="0" w:color="404040"/>
               <w:right w:val="single" w:sz="8" w:space="0" w:color="404040"/>
             </w:tcBorders>
-            <w:shd w:fill="D9D9D9" w:val="clear"/>
+            <w:shd w:fill="D4EEE5" w:val="clear"/>
           </w:tcPr>
           <w:p>
             <w:pPr>
@@ -3115,7 +3115,7 @@
                 <w:color w:val="30302F"/>
                 <w:sz w:val="20"/>
               </w:rPr>
-              <w:t>---</w:t>
+              <w:t>790</w:t>
             </w:r>
           </w:p>
         </w:tc>
@@ -3149,7 +3149,7 @@
                 <w:color w:val="30302F"/>
                 <w:sz w:val="20"/>
               </w:rPr>
-              <w:t>10</w:t>
+              <w:t>5</w:t>
             </w:r>
           </w:p>
         </w:tc>
@@ -3183,7 +3183,7 @@
                 <w:color w:val="30302F"/>
                 <w:sz w:val="20"/>
               </w:rPr>
-              <w:t>50</w:t>
+              <w:t>55</w:t>
             </w:r>
           </w:p>
         </w:tc>
@@ -3217,7 +3217,7 @@
                 <w:color w:val="30302F"/>
                 <w:sz w:val="20"/>
               </w:rPr>
-              <w:t>70</w:t>
+              <w:t>860</w:t>
             </w:r>
           </w:p>
         </w:tc>
@@ -3322,7 +3322,7 @@
                 <w:color w:val="30302F"/>
                 <w:sz w:val="20"/>
               </w:rPr>
-              <w:t>5</w:t>
+              <w:t>0</w:t>
             </w:r>
           </w:p>
         </w:tc>
@@ -3335,7 +3335,7 @@
               <w:bottom w:val="single" w:sz="8" w:space="0" w:color="404040"/>
               <w:right w:val="single" w:sz="8" w:space="0" w:color="404040"/>
             </w:tcBorders>
-            <w:shd w:fill="D9D9D9" w:val="clear"/>
+            <w:shd w:fill="D4EEE5" w:val="clear"/>
           </w:tcPr>
           <w:p>
             <w:pPr>
@@ -3357,7 +3357,7 @@
                 <w:color w:val="30302F"/>
                 <w:sz w:val="20"/>
               </w:rPr>
-              <w:t>---</w:t>
+              <w:t>300</w:t>
             </w:r>
           </w:p>
         </w:tc>
@@ -3391,7 +3391,7 @@
                 <w:color w:val="30302F"/>
                 <w:sz w:val="20"/>
               </w:rPr>
-              <w:t>10</w:t>
+              <w:t>15</w:t>
             </w:r>
           </w:p>
         </w:tc>
@@ -3425,7 +3425,7 @@
                 <w:color w:val="30302F"/>
                 <w:sz w:val="20"/>
               </w:rPr>
-              <w:t>15</w:t>
+              <w:t>315</w:t>
             </w:r>
           </w:p>
         </w:tc>
@@ -3530,7 +3530,7 @@
                 <w:color w:val="30302F"/>
                 <w:sz w:val="20"/>
               </w:rPr>
-              <w:t>15</w:t>
+              <w:t>20</w:t>
             </w:r>
           </w:p>
         </w:tc>
@@ -3564,7 +3564,7 @@
                 <w:color w:val="30302F"/>
                 <w:sz w:val="20"/>
               </w:rPr>
-              <w:t>25</w:t>
+              <w:t>35</w:t>
             </w:r>
           </w:p>
         </w:tc>
@@ -3577,7 +3577,7 @@
               <w:bottom w:val="single" w:sz="8" w:space="0" w:color="404040"/>
               <w:right w:val="single" w:sz="8" w:space="0" w:color="404040"/>
             </w:tcBorders>
-            <w:shd w:fill="D9D9D9" w:val="clear"/>
+            <w:shd w:fill="D4EEE5" w:val="clear"/>
           </w:tcPr>
           <w:p>
             <w:pPr>
@@ -3599,7 +3599,7 @@
                 <w:color w:val="30302F"/>
                 <w:sz w:val="20"/>
               </w:rPr>
-              <w:t>---</w:t>
+              <w:t>7 500</w:t>
             </w:r>
           </w:p>
         </w:tc>
@@ -3633,7 +3633,7 @@
                 <w:color w:val="30302F"/>
                 <w:sz w:val="20"/>
               </w:rPr>
-              <w:t>70</w:t>
+              <w:t>7 585</w:t>
             </w:r>
           </w:p>
         </w:tc>
@@ -3648,7 +3648,7 @@
               <w:bottom w:val="single" w:sz="8" w:space="0" w:color="404040"/>
               <w:right w:val="single" w:sz="8" w:space="0" w:color="404040"/>
             </w:tcBorders>
-            <w:shd w:fill="3B9C7B" w:val="clear"/>
+            <w:shd w:fill="0A5455" w:val="clear"/>
           </w:tcPr>
           <w:p>
             <w:pPr>
@@ -3670,7 +3670,7 @@
                 <w:color w:val="FFFFFF"/>
                 <w:sz w:val="20"/>
               </w:rPr>
-              <w:t>Total additions</w:t>
+              <w:t>Closing total</w:t>
             </w:r>
           </w:p>
         </w:tc>
@@ -3705,7 +3705,7 @@
                 <w:color w:val="FFFFFF"/>
                 <w:sz w:val="20"/>
               </w:rPr>
-              <w:t>40</w:t>
+              <w:t>1 180</w:t>
             </w:r>
           </w:p>
         </w:tc>
@@ -3740,7 +3740,7 @@
                 <w:color w:val="FFFFFF"/>
                 <w:sz w:val="20"/>
               </w:rPr>
-              <w:t>35</w:t>
+              <w:t>825</w:t>
             </w:r>
           </w:p>
         </w:tc>
@@ -3775,7 +3775,7 @@
                 <w:color w:val="FFFFFF"/>
                 <w:sz w:val="20"/>
               </w:rPr>
-              <w:t>40</w:t>
+              <w:t>340</w:t>
             </w:r>
           </w:p>
         </w:tc>
@@ -3810,7 +3810,7 @@
                 <w:color w:val="FFFFFF"/>
                 <w:sz w:val="20"/>
               </w:rPr>
-              <w:t>140</w:t>
+              <w:t>7 655</w:t>
             </w:r>
           </w:p>
         </w:tc>
@@ -3845,7 +3845,7 @@
                 <w:color w:val="FFFFFF"/>
                 <w:sz w:val="20"/>
               </w:rPr>
-              <w:t>---</w:t>
+              <w:t>10 000</w:t>
             </w:r>
           </w:p>
         </w:tc>
@@ -5646,7 +5646,7 @@
                 <w:color w:val="FFFFFF"/>
                 <w:sz w:val="20"/>
               </w:rPr>
-              <w:t>--</w:t>
+              <w:t>average</w:t>
             </w:r>
           </w:p>
         </w:tc>
@@ -5681,7 +5681,6 @@
                 <w:color w:val="FFFFFF"/>
                 <w:sz w:val="20"/>
               </w:rPr>
-              <w:t>--</w:t>
             </w:r>
           </w:p>
         </w:tc>

</xml_diff>